<commit_message>
Bash Functions + HTTP Health Checker - Complete
</commit_message>
<xml_diff>
--- a/.journal/memorizing/essential-keyboard-shortcuts.docx
+++ b/.journal/memorizing/essential-keyboard-shortcuts.docx
@@ -485,7 +485,12 @@
               <w:spacing w:after="0"/>
             </w:pPr>
             <w:r>
-              <w:t>Clipboard History</w:t>
+              <w:t>Clipb</w:t>
+            </w:r>
+            <w:bookmarkStart w:id="0" w:name="_GoBack"/>
+            <w:bookmarkEnd w:id="0"/>
+            <w:r>
+              <w:t>oard History</w:t>
             </w:r>
           </w:p>
         </w:tc>
@@ -510,6 +515,375 @@
               <w:right w:w="180" w:type="dxa"/>
             </w:tcMar>
             <w:vAlign w:val="center"/>
+          </w:tcPr>
+          <w:p>
+            <w:pPr>
+              <w:spacing w:after="0"/>
+            </w:pPr>
+          </w:p>
+        </w:tc>
+        <w:tc>
+          <w:tcPr>
+            <w:tcW w:w="0" w:type="auto"/>
+            <w:tcBorders>
+              <w:top w:val="single" w:sz="6" w:space="0" w:color="C4C7C5"/>
+              <w:left w:val="single" w:sz="6" w:space="0" w:color="C4C7C5"/>
+              <w:bottom w:val="single" w:sz="6" w:space="0" w:color="C4C7C5"/>
+              <w:right w:val="single" w:sz="6" w:space="0" w:color="C4C7C5"/>
+            </w:tcBorders>
+            <w:tcMar>
+              <w:top w:w="120" w:type="dxa"/>
+              <w:left w:w="180" w:type="dxa"/>
+              <w:bottom w:w="120" w:type="dxa"/>
+              <w:right w:w="180" w:type="dxa"/>
+            </w:tcMar>
+            <w:vAlign w:val="center"/>
+          </w:tcPr>
+          <w:p>
+            <w:pPr>
+              <w:spacing w:after="0"/>
+              <w:rPr>
+                <w:rStyle w:val="HTMLCode"/>
+                <w:rFonts w:eastAsiaTheme="minorHAnsi"/>
+              </w:rPr>
+            </w:pPr>
+            <w:r>
+              <w:rPr>
+                <w:rStyle w:val="HTMLCode"/>
+                <w:rFonts w:eastAsiaTheme="minorHAnsi"/>
+              </w:rPr>
+              <w:t>WIN + X</w:t>
+            </w:r>
+          </w:p>
+        </w:tc>
+        <w:tc>
+          <w:tcPr>
+            <w:tcW w:w="0" w:type="auto"/>
+            <w:tcBorders>
+              <w:top w:val="single" w:sz="6" w:space="0" w:color="C4C7C5"/>
+              <w:left w:val="single" w:sz="6" w:space="0" w:color="C4C7C5"/>
+              <w:bottom w:val="single" w:sz="6" w:space="0" w:color="C4C7C5"/>
+              <w:right w:val="single" w:sz="6" w:space="0" w:color="C4C7C5"/>
+            </w:tcBorders>
+            <w:tcMar>
+              <w:top w:w="120" w:type="dxa"/>
+              <w:left w:w="180" w:type="dxa"/>
+              <w:bottom w:w="120" w:type="dxa"/>
+              <w:right w:w="180" w:type="dxa"/>
+            </w:tcMar>
+            <w:vAlign w:val="center"/>
+          </w:tcPr>
+          <w:p>
+            <w:pPr>
+              <w:spacing w:after="0"/>
+            </w:pPr>
+            <w:r>
+              <w:t>Quick Menu</w:t>
+            </w:r>
+          </w:p>
+        </w:tc>
+      </w:tr>
+      <w:tr>
+        <w:trPr>
+          <w:tblCellSpacing w:w="15" w:type="dxa"/>
+        </w:trPr>
+        <w:tc>
+          <w:tcPr>
+            <w:tcW w:w="0" w:type="auto"/>
+            <w:tcBorders>
+              <w:top w:val="single" w:sz="6" w:space="0" w:color="C4C7C5"/>
+              <w:left w:val="single" w:sz="6" w:space="0" w:color="C4C7C5"/>
+              <w:bottom w:val="single" w:sz="6" w:space="0" w:color="C4C7C5"/>
+              <w:right w:val="single" w:sz="6" w:space="0" w:color="C4C7C5"/>
+            </w:tcBorders>
+            <w:tcMar>
+              <w:top w:w="120" w:type="dxa"/>
+              <w:left w:w="180" w:type="dxa"/>
+              <w:bottom w:w="120" w:type="dxa"/>
+              <w:right w:w="180" w:type="dxa"/>
+            </w:tcMar>
+            <w:vAlign w:val="center"/>
+          </w:tcPr>
+          <w:p>
+            <w:pPr>
+              <w:spacing w:after="0"/>
+            </w:pPr>
+          </w:p>
+        </w:tc>
+        <w:tc>
+          <w:tcPr>
+            <w:tcW w:w="0" w:type="auto"/>
+            <w:tcBorders>
+              <w:top w:val="single" w:sz="6" w:space="0" w:color="C4C7C5"/>
+              <w:left w:val="single" w:sz="6" w:space="0" w:color="C4C7C5"/>
+              <w:bottom w:val="single" w:sz="6" w:space="0" w:color="C4C7C5"/>
+              <w:right w:val="single" w:sz="6" w:space="0" w:color="C4C7C5"/>
+            </w:tcBorders>
+            <w:tcMar>
+              <w:top w:w="120" w:type="dxa"/>
+              <w:left w:w="180" w:type="dxa"/>
+              <w:bottom w:w="120" w:type="dxa"/>
+              <w:right w:w="180" w:type="dxa"/>
+            </w:tcMar>
+            <w:vAlign w:val="center"/>
+          </w:tcPr>
+          <w:p>
+            <w:pPr>
+              <w:spacing w:after="0"/>
+              <w:rPr>
+                <w:rStyle w:val="HTMLCode"/>
+                <w:rFonts w:eastAsiaTheme="minorHAnsi"/>
+              </w:rPr>
+            </w:pPr>
+            <w:r>
+              <w:rPr>
+                <w:rStyle w:val="HTMLCode"/>
+                <w:rFonts w:eastAsiaTheme="minorHAnsi"/>
+              </w:rPr>
+              <w:t>WIN + X then U then U</w:t>
+            </w:r>
+          </w:p>
+        </w:tc>
+        <w:tc>
+          <w:tcPr>
+            <w:tcW w:w="0" w:type="auto"/>
+            <w:tcBorders>
+              <w:top w:val="single" w:sz="6" w:space="0" w:color="C4C7C5"/>
+              <w:left w:val="single" w:sz="6" w:space="0" w:color="C4C7C5"/>
+              <w:bottom w:val="single" w:sz="6" w:space="0" w:color="C4C7C5"/>
+              <w:right w:val="single" w:sz="6" w:space="0" w:color="C4C7C5"/>
+            </w:tcBorders>
+            <w:tcMar>
+              <w:top w:w="120" w:type="dxa"/>
+              <w:left w:w="180" w:type="dxa"/>
+              <w:bottom w:w="120" w:type="dxa"/>
+              <w:right w:w="180" w:type="dxa"/>
+            </w:tcMar>
+            <w:vAlign w:val="center"/>
+          </w:tcPr>
+          <w:p>
+            <w:pPr>
+              <w:spacing w:after="0"/>
+            </w:pPr>
+            <w:r>
+              <w:t>Shutdown System</w:t>
+            </w:r>
+          </w:p>
+        </w:tc>
+      </w:tr>
+      <w:tr>
+        <w:trPr>
+          <w:tblCellSpacing w:w="15" w:type="dxa"/>
+        </w:trPr>
+        <w:tc>
+          <w:tcPr>
+            <w:tcW w:w="0" w:type="auto"/>
+            <w:tcBorders>
+              <w:top w:val="single" w:sz="6" w:space="0" w:color="C4C7C5"/>
+              <w:left w:val="single" w:sz="6" w:space="0" w:color="C4C7C5"/>
+              <w:bottom w:val="single" w:sz="6" w:space="0" w:color="C4C7C5"/>
+              <w:right w:val="single" w:sz="6" w:space="0" w:color="C4C7C5"/>
+            </w:tcBorders>
+            <w:tcMar>
+              <w:top w:w="120" w:type="dxa"/>
+              <w:left w:w="180" w:type="dxa"/>
+              <w:bottom w:w="120" w:type="dxa"/>
+              <w:right w:w="180" w:type="dxa"/>
+            </w:tcMar>
+            <w:vAlign w:val="center"/>
+          </w:tcPr>
+          <w:p>
+            <w:pPr>
+              <w:spacing w:after="0"/>
+            </w:pPr>
+          </w:p>
+        </w:tc>
+        <w:tc>
+          <w:tcPr>
+            <w:tcW w:w="0" w:type="auto"/>
+            <w:tcBorders>
+              <w:top w:val="single" w:sz="6" w:space="0" w:color="C4C7C5"/>
+              <w:left w:val="single" w:sz="6" w:space="0" w:color="C4C7C5"/>
+              <w:bottom w:val="single" w:sz="6" w:space="0" w:color="C4C7C5"/>
+              <w:right w:val="single" w:sz="6" w:space="0" w:color="C4C7C5"/>
+            </w:tcBorders>
+            <w:tcMar>
+              <w:top w:w="120" w:type="dxa"/>
+              <w:left w:w="180" w:type="dxa"/>
+              <w:bottom w:w="120" w:type="dxa"/>
+              <w:right w:w="180" w:type="dxa"/>
+            </w:tcMar>
+            <w:vAlign w:val="center"/>
+          </w:tcPr>
+          <w:p>
+            <w:pPr>
+              <w:spacing w:after="0"/>
+              <w:rPr>
+                <w:rStyle w:val="HTMLCode"/>
+                <w:rFonts w:eastAsiaTheme="minorHAnsi"/>
+              </w:rPr>
+            </w:pPr>
+            <w:r>
+              <w:rPr>
+                <w:rStyle w:val="HTMLCode"/>
+                <w:rFonts w:eastAsiaTheme="minorHAnsi"/>
+              </w:rPr>
+              <w:t xml:space="preserve">WIN + X then U then </w:t>
+            </w:r>
+            <w:r>
+              <w:rPr>
+                <w:rStyle w:val="HTMLCode"/>
+                <w:rFonts w:eastAsiaTheme="minorHAnsi"/>
+              </w:rPr>
+              <w:t>R</w:t>
+            </w:r>
+          </w:p>
+        </w:tc>
+        <w:tc>
+          <w:tcPr>
+            <w:tcW w:w="0" w:type="auto"/>
+            <w:tcBorders>
+              <w:top w:val="single" w:sz="6" w:space="0" w:color="C4C7C5"/>
+              <w:left w:val="single" w:sz="6" w:space="0" w:color="C4C7C5"/>
+              <w:bottom w:val="single" w:sz="6" w:space="0" w:color="C4C7C5"/>
+              <w:right w:val="single" w:sz="6" w:space="0" w:color="C4C7C5"/>
+            </w:tcBorders>
+            <w:tcMar>
+              <w:top w:w="120" w:type="dxa"/>
+              <w:left w:w="180" w:type="dxa"/>
+              <w:bottom w:w="120" w:type="dxa"/>
+              <w:right w:w="180" w:type="dxa"/>
+            </w:tcMar>
+            <w:vAlign w:val="center"/>
+          </w:tcPr>
+          <w:p>
+            <w:pPr>
+              <w:spacing w:after="0"/>
+            </w:pPr>
+            <w:r>
+              <w:t>Restart</w:t>
+            </w:r>
+            <w:r>
+              <w:t xml:space="preserve"> System</w:t>
+            </w:r>
+          </w:p>
+        </w:tc>
+      </w:tr>
+      <w:tr>
+        <w:trPr>
+          <w:tblCellSpacing w:w="15" w:type="dxa"/>
+        </w:trPr>
+        <w:tc>
+          <w:tcPr>
+            <w:tcW w:w="0" w:type="auto"/>
+            <w:tcBorders>
+              <w:top w:val="single" w:sz="6" w:space="0" w:color="C4C7C5"/>
+              <w:left w:val="single" w:sz="6" w:space="0" w:color="C4C7C5"/>
+              <w:bottom w:val="single" w:sz="6" w:space="0" w:color="C4C7C5"/>
+              <w:right w:val="single" w:sz="6" w:space="0" w:color="C4C7C5"/>
+            </w:tcBorders>
+            <w:tcMar>
+              <w:top w:w="120" w:type="dxa"/>
+              <w:left w:w="180" w:type="dxa"/>
+              <w:bottom w:w="120" w:type="dxa"/>
+              <w:right w:w="180" w:type="dxa"/>
+            </w:tcMar>
+            <w:vAlign w:val="center"/>
+          </w:tcPr>
+          <w:p>
+            <w:pPr>
+              <w:spacing w:after="0"/>
+            </w:pPr>
+          </w:p>
+        </w:tc>
+        <w:tc>
+          <w:tcPr>
+            <w:tcW w:w="0" w:type="auto"/>
+            <w:tcBorders>
+              <w:top w:val="single" w:sz="6" w:space="0" w:color="C4C7C5"/>
+              <w:left w:val="single" w:sz="6" w:space="0" w:color="C4C7C5"/>
+              <w:bottom w:val="single" w:sz="6" w:space="0" w:color="C4C7C5"/>
+              <w:right w:val="single" w:sz="6" w:space="0" w:color="C4C7C5"/>
+            </w:tcBorders>
+            <w:tcMar>
+              <w:top w:w="120" w:type="dxa"/>
+              <w:left w:w="180" w:type="dxa"/>
+              <w:bottom w:w="120" w:type="dxa"/>
+              <w:right w:w="180" w:type="dxa"/>
+            </w:tcMar>
+            <w:vAlign w:val="center"/>
+          </w:tcPr>
+          <w:p>
+            <w:pPr>
+              <w:spacing w:after="0"/>
+              <w:rPr>
+                <w:rStyle w:val="HTMLCode"/>
+                <w:rFonts w:eastAsiaTheme="minorHAnsi"/>
+              </w:rPr>
+            </w:pPr>
+            <w:r>
+              <w:rPr>
+                <w:rStyle w:val="HTMLCode"/>
+                <w:rFonts w:eastAsiaTheme="minorHAnsi"/>
+              </w:rPr>
+              <w:t xml:space="preserve">WIN + X then </w:t>
+            </w:r>
+            <w:r>
+              <w:rPr>
+                <w:rStyle w:val="HTMLCode"/>
+                <w:rFonts w:eastAsiaTheme="minorHAnsi"/>
+              </w:rPr>
+              <w:t>A</w:t>
+            </w:r>
+          </w:p>
+        </w:tc>
+        <w:tc>
+          <w:tcPr>
+            <w:tcW w:w="0" w:type="auto"/>
+            <w:tcBorders>
+              <w:top w:val="single" w:sz="6" w:space="0" w:color="C4C7C5"/>
+              <w:left w:val="single" w:sz="6" w:space="0" w:color="C4C7C5"/>
+              <w:bottom w:val="single" w:sz="6" w:space="0" w:color="C4C7C5"/>
+              <w:right w:val="single" w:sz="6" w:space="0" w:color="C4C7C5"/>
+            </w:tcBorders>
+            <w:tcMar>
+              <w:top w:w="120" w:type="dxa"/>
+              <w:left w:w="180" w:type="dxa"/>
+              <w:bottom w:w="120" w:type="dxa"/>
+              <w:right w:w="180" w:type="dxa"/>
+            </w:tcMar>
+            <w:vAlign w:val="center"/>
+          </w:tcPr>
+          <w:p>
+            <w:pPr>
+              <w:spacing w:after="0"/>
+            </w:pPr>
+            <w:r>
+              <w:t>Open Terminal (Admin)</w:t>
+            </w:r>
+          </w:p>
+        </w:tc>
+      </w:tr>
+      <w:tr>
+        <w:trPr>
+          <w:tblCellSpacing w:w="15" w:type="dxa"/>
+        </w:trPr>
+        <w:tc>
+          <w:tcPr>
+            <w:tcW w:w="0" w:type="auto"/>
+            <w:tcBorders>
+              <w:top w:val="single" w:sz="6" w:space="0" w:color="C4C7C5"/>
+              <w:left w:val="single" w:sz="6" w:space="0" w:color="C4C7C5"/>
+              <w:bottom w:val="single" w:sz="6" w:space="0" w:color="C4C7C5"/>
+              <w:right w:val="single" w:sz="6" w:space="0" w:color="C4C7C5"/>
+            </w:tcBorders>
+            <w:tcMar>
+              <w:top w:w="120" w:type="dxa"/>
+              <w:left w:w="180" w:type="dxa"/>
+              <w:bottom w:w="120" w:type="dxa"/>
+              <w:right w:w="180" w:type="dxa"/>
+            </w:tcMar>
+            <w:vAlign w:val="center"/>
             <w:hideMark/>
           </w:tcPr>
           <w:p>
@@ -579,13 +953,7 @@
               <w:spacing w:after="0"/>
             </w:pPr>
             <w:r>
-              <w:t>Snap windows (sides/corners</w:t>
-            </w:r>
-            <w:r>
-              <w:t>/full</w:t>
-            </w:r>
-            <w:r>
-              <w:t>)</w:t>
+              <w:t>Snap windows (sides/corners/full)</w:t>
             </w:r>
           </w:p>
         </w:tc>
@@ -1818,30 +2186,7 @@
                 <w:rStyle w:val="HTMLCode"/>
                 <w:rFonts w:eastAsiaTheme="minorHAnsi"/>
               </w:rPr>
-              <w:t xml:space="preserve"> </w:t>
-            </w:r>
-            <w:r>
-              <w:rPr>
-                <w:rStyle w:val="HTMLCode"/>
-                <w:rFonts w:eastAsiaTheme="minorHAnsi"/>
-              </w:rPr>
-              <w:t xml:space="preserve">/ Ctrl + </w:t>
-            </w:r>
-            <w:r>
-              <w:rPr>
-                <w:rStyle w:val="HTMLCode"/>
-                <w:rFonts w:eastAsiaTheme="minorHAnsi"/>
-              </w:rPr>
-              <w:t>righ</w:t>
-            </w:r>
-            <w:bookmarkStart w:id="0" w:name="_GoBack"/>
-            <w:bookmarkEnd w:id="0"/>
-            <w:r>
-              <w:rPr>
-                <w:rStyle w:val="HTMLCode"/>
-                <w:rFonts w:eastAsiaTheme="minorHAnsi"/>
-              </w:rPr>
-              <w:t>t</w:t>
+              <w:t xml:space="preserve"> / Ctrl + right</w:t>
             </w:r>
           </w:p>
         </w:tc>
@@ -4971,7 +5316,7 @@
 </file>
 
 <file path=customXml/itemProps1.xml><?xml version="1.0" encoding="utf-8"?>
-<ds:datastoreItem xmlns:ds="http://schemas.openxmlformats.org/officeDocument/2006/customXml" ds:itemID="{E9A9E812-A4BC-4544-9F38-262662DCFBB8}">
+<ds:datastoreItem xmlns:ds="http://schemas.openxmlformats.org/officeDocument/2006/customXml" ds:itemID="{731C58ED-34B0-4F0C-AB37-1320BE9B7E65}">
   <ds:schemaRefs>
     <ds:schemaRef ds:uri="http://schemas.openxmlformats.org/officeDocument/2006/bibliography"/>
   </ds:schemaRefs>

</xml_diff>